<commit_message>
Give the supporting materials its own reference list
The report cited [1]-[14] throughout but carried no reference list, so none
of those citations resolved. It now ends with a References section holding
all 24 entries, matching the exemplar supporting-materials document, which
carries its own numbered list separate from the paper's.

The entries are pulled programmatically from the paper's list at build
time rather than retyped, so the two documents cannot drift apart, and the
numbering is shared between them.

Section 4.3 now cites the models and tools it tabulates, so entries [15]-[24]
are used rather than listed unreferenced.

Co-Authored-By: Claude Opus 5 <noreply@anthropic.com>
Claude-Session: https://claude.ai/code/session_01HkkBxSJKEdB6STiXiiZ49K
</commit_message>
<xml_diff>
--- a/docs/report/supporting_materials.docx
+++ b/docs/report/supporting_materials.docx
@@ -4618,6 +4618,9 @@
               </w:rPr>
               <w:t xml:space="preserve">whisper-small</w:t>
             </w:r>
+            <w:r>
+              <w:t xml:space="preserve"> [6]</w:t>
+            </w:r>
           </w:p>
         </w:tc>
         <w:tc>
@@ -4685,6 +4688,9 @@
               </w:rPr>
               <w:t xml:space="preserve">whisper-turbo</w:t>
             </w:r>
+            <w:r>
+              <w:t xml:space="preserve"> [6]</w:t>
+            </w:r>
           </w:p>
         </w:tc>
         <w:tc>
@@ -4745,7 +4751,7 @@
               <w:spacing w:after="0"/>
             </w:pPr>
             <w:r>
-              <w:t xml:space="preserve">Tesseract; EasyOCR</w:t>
+              <w:t xml:space="preserve">Tesseract [17]; EasyOCR</w:t>
             </w:r>
           </w:p>
         </w:tc>
@@ -4814,6 +4820,9 @@
               </w:rPr>
               <w:t xml:space="preserve">openai/clip-vit-base-patch32</w:t>
             </w:r>
+            <w:r>
+              <w:t xml:space="preserve"> [5]</w:t>
+            </w:r>
           </w:p>
         </w:tc>
         <w:tc>
@@ -4881,6 +4890,9 @@
               </w:rPr>
               <w:t xml:space="preserve">openai/clip-vit-large-patch14</w:t>
             </w:r>
+            <w:r>
+              <w:t xml:space="preserve"> [5]</w:t>
+            </w:r>
           </w:p>
         </w:tc>
         <w:tc>
@@ -4946,10 +4958,10 @@
                 <w:sz w:val="18"/>
                 <w:szCs w:val="18"/>
               </w:rPr>
-              <w:t xml:space="preserve">Salesforce/blip-vqa-base</w:t>
-            </w:r>
-            <w:r>
-              <w:t xml:space="preserve">; </w:t>
+              <w:t xml:space="preserve">blip-vqa-base</w:t>
+            </w:r>
+            <w:r>
+              <w:t xml:space="preserve"> [7]; </w:t>
             </w:r>
             <w:r>
               <w:rPr>
@@ -4957,10 +4969,10 @@
                 <w:sz w:val="18"/>
                 <w:szCs w:val="18"/>
               </w:rPr>
-              <w:t xml:space="preserve">dandelin/vilt-b32-finetuned-vqa</w:t>
-            </w:r>
-            <w:r>
-              <w:t xml:space="preserve">; </w:t>
+              <w:t xml:space="preserve">vilt-b32-finetuned-vqa</w:t>
+            </w:r>
+            <w:r>
+              <w:t xml:space="preserve"> [8]; </w:t>
             </w:r>
             <w:r>
               <w:rPr>
@@ -4968,7 +4980,10 @@
                 <w:sz w:val="18"/>
                 <w:szCs w:val="18"/>
               </w:rPr>
-              <w:t xml:space="preserve">facebook/detr-resnet-50</w:t>
+              <w:t xml:space="preserve">detr-resnet-50</w:t>
+            </w:r>
+            <w:r>
+              <w:t xml:space="preserve"> [9]</w:t>
             </w:r>
           </w:p>
         </w:tc>
@@ -5030,7 +5045,7 @@
               <w:spacing w:after="0"/>
             </w:pPr>
             <w:r>
-              <w:t xml:space="preserve">KeyBERT (</w:t>
+              <w:t xml:space="preserve">KeyBERT [20] (</w:t>
             </w:r>
             <w:r>
               <w:rPr>
@@ -5041,7 +5056,7 @@
               <w:t xml:space="preserve">all-MiniLM-L6-v2</w:t>
             </w:r>
             <w:r>
-              <w:t xml:space="preserve">); YAKE; TF-IDF</w:t>
+              <w:t xml:space="preserve"> [18]); YAKE [19]; TF-IDF</w:t>
             </w:r>
           </w:p>
         </w:tc>
@@ -5180,7 +5195,7 @@
               <w:spacing w:after="0"/>
             </w:pPr>
             <w:r>
-              <w:t xml:space="preserve">Qwen3-VL 2B/4B/8B (Instruct, Thinking); InternVL3-2B/-8B</w:t>
+              <w:t xml:space="preserve">Qwen3-VL [12] 2B/4B/8B (Instruct, Thinking); InternVL3 [13] -2B/-8B</w:t>
             </w:r>
           </w:p>
         </w:tc>
@@ -5199,7 +5214,7 @@
               <w:spacing w:after="0"/>
             </w:pPr>
             <w:r>
-              <w:t xml:space="preserve">8B models int4</w:t>
+              <w:t xml:space="preserve">8B models int4, loaded through the Transformers image-text-to-text interface [23]</w:t>
             </w:r>
           </w:p>
         </w:tc>
@@ -5209,6 +5224,15 @@
       <w:pPr>
         <w:spacing w:after="160"/>
       </w:pPr>
+    </w:p>
+    <w:p>
+      <w:pPr>
+        <w:spacing w:after="140" w:line="276"/>
+        <w:jc w:val="both"/>
+      </w:pPr>
+      <w:r>
+        <w:t xml:space="preserve">Scene detection uses PySceneDetect [15]; the benchmark's free-text fields are scored with ROUGE-L recall [16]. A video-native model such as PPLLaVA [22], run through the video-text-to-text interface [24], would remove the fixed frame budget discussed in §4.4, and metadata-aware retrieval work [21] motivates publishing per-field structure rather than a flat caption.</w:t>
+      </w:r>
     </w:p>
     <w:p>
       <w:pPr>
@@ -9234,6 +9258,468 @@
       </w:pPr>
       <w:r>
         <w:t xml:space="preserve">Run 01 top to bottom on a GPU runtime with the Drive layout in its header cell; run 02 on a GPU node; run 03 anywhere. All three are resumable and skip completed work.</w:t>
+      </w:r>
+    </w:p>
+    <w:p>
+      <w:pPr>
+        <w:pStyle w:val="Heading1"/>
+        <w:pageBreakBefore/>
+        <w:spacing w:after="140" w:before="400"/>
+      </w:pPr>
+      <w:r>
+        <w:rPr>
+          <w:b/>
+          <w:bCs/>
+          <w:sz w:val="28"/>
+          <w:szCs w:val="28"/>
+        </w:rPr>
+        <w:t xml:space="preserve">References</w:t>
+      </w:r>
+    </w:p>
+    <w:p>
+      <w:pPr>
+        <w:spacing w:after="140" w:line="276"/>
+        <w:jc w:val="both"/>
+      </w:pPr>
+      <w:r>
+        <w:t xml:space="preserve">[1] A. F. Smeaton, P. Over, and W. Kraaij, "Evaluation campaigns and TRECVid," in </w:t>
+      </w:r>
+      <w:r>
+        <w:rPr>
+          <w:i/>
+          <w:iCs/>
+        </w:rPr>
+        <w:t xml:space="preserve">Proc. 8th ACM Int. Workshop on Multimedia Information Retrieval (MIR)</w:t>
+      </w:r>
+      <w:r>
+        <w:t xml:space="preserve">, 2006, pp. 321–330.</w:t>
+      </w:r>
+    </w:p>
+    <w:p>
+      <w:pPr>
+        <w:spacing w:after="140" w:line="276"/>
+        <w:jc w:val="both"/>
+      </w:pPr>
+      <w:r>
+        <w:t xml:space="preserve">[2] M. Mühling, M. Meister, N. Korfhage, J. Wehling, A. Hörth, R. Ewerth, and B. Freisleben, "Content-based video retrieval in historical collections of the German Broadcasting Archive," </w:t>
+      </w:r>
+      <w:r>
+        <w:rPr>
+          <w:i/>
+          <w:iCs/>
+        </w:rPr>
+        <w:t xml:space="preserve">Int. J. on Digital Libraries</w:t>
+      </w:r>
+      <w:r>
+        <w:t xml:space="preserve">, vol. 20, no. 2, pp. 167–183, 2019, doi: 10.1007/s00799-018-0236-z.</w:t>
+      </w:r>
+    </w:p>
+    <w:p>
+      <w:pPr>
+        <w:spacing w:after="140" w:line="276"/>
+        <w:jc w:val="both"/>
+      </w:pPr>
+      <w:r>
+        <w:t xml:space="preserve">[3] M. Mühling, N. Korfhage, K. Pustu-Iren, J. Bars, M. Knapp, H. Bellafkir, M. Vogelbacher, D. Schneider, A. Hörth, R. Ewerth, and B. Freisleben, "VIVA: Visual information retrieval in video archives," </w:t>
+      </w:r>
+      <w:r>
+        <w:rPr>
+          <w:i/>
+          <w:iCs/>
+        </w:rPr>
+        <w:t xml:space="preserve">Int. J. on Digital Libraries</w:t>
+      </w:r>
+      <w:r>
+        <w:t xml:space="preserve">, vol. 23, no. 4, pp. 319–333, 2022, doi: 10.1007/s00799-022-00337-y.</w:t>
+      </w:r>
+    </w:p>
+    <w:p>
+      <w:pPr>
+        <w:spacing w:after="140" w:line="276"/>
+        <w:jc w:val="both"/>
+      </w:pPr>
+      <w:r>
+        <w:t xml:space="preserve">[4] F. Pessanha and A. Akdag Salah, "A computational look at oral history archives," </w:t>
+      </w:r>
+      <w:r>
+        <w:rPr>
+          <w:i/>
+          <w:iCs/>
+        </w:rPr>
+        <w:t xml:space="preserve">ACM J. on Computing and Cultural Heritage</w:t>
+      </w:r>
+      <w:r>
+        <w:t xml:space="preserve">, vol. 15, no. 1, art. 6, pp. 1–16, 2022, doi: 10.1145/3477605.</w:t>
+      </w:r>
+    </w:p>
+    <w:p>
+      <w:pPr>
+        <w:spacing w:after="140" w:line="276"/>
+        <w:jc w:val="both"/>
+      </w:pPr>
+      <w:r>
+        <w:t xml:space="preserve">[5] A. Radford </w:t>
+      </w:r>
+      <w:r>
+        <w:rPr>
+          <w:i/>
+          <w:iCs/>
+        </w:rPr>
+        <w:t xml:space="preserve">et al.</w:t>
+      </w:r>
+      <w:r>
+        <w:t xml:space="preserve">, "Learning transferable visual models from natural language supervision," in </w:t>
+      </w:r>
+      <w:r>
+        <w:rPr>
+          <w:i/>
+          <w:iCs/>
+        </w:rPr>
+        <w:t xml:space="preserve">Proc. 38th Int. Conf. Machine Learning (ICML)</w:t>
+      </w:r>
+      <w:r>
+        <w:t xml:space="preserve">, 2021, pp. 8748–8763.</w:t>
+      </w:r>
+    </w:p>
+    <w:p>
+      <w:pPr>
+        <w:spacing w:after="140" w:line="276"/>
+        <w:jc w:val="both"/>
+      </w:pPr>
+      <w:r>
+        <w:t xml:space="preserve">[6] A. Radford </w:t>
+      </w:r>
+      <w:r>
+        <w:rPr>
+          <w:i/>
+          <w:iCs/>
+        </w:rPr>
+        <w:t xml:space="preserve">et al.</w:t>
+      </w:r>
+      <w:r>
+        <w:t xml:space="preserve">, "Robust speech recognition via large-scale weak supervision," in </w:t>
+      </w:r>
+      <w:r>
+        <w:rPr>
+          <w:i/>
+          <w:iCs/>
+        </w:rPr>
+        <w:t xml:space="preserve">Proc. 40th Int. Conf. Machine Learning (ICML)</w:t>
+      </w:r>
+      <w:r>
+        <w:t xml:space="preserve">, 2023, pp. 28492–28518.</w:t>
+      </w:r>
+    </w:p>
+    <w:p>
+      <w:pPr>
+        <w:spacing w:after="140" w:line="276"/>
+        <w:jc w:val="both"/>
+      </w:pPr>
+      <w:r>
+        <w:t xml:space="preserve">[7] J. Li, D. Li, C. Xiong, and S. Hoi, "BLIP: Bootstrapping language-image pre-training for unified vision-language understanding and generation," in </w:t>
+      </w:r>
+      <w:r>
+        <w:rPr>
+          <w:i/>
+          <w:iCs/>
+        </w:rPr>
+        <w:t xml:space="preserve">Proc. 39th Int. Conf. Machine Learning (ICML)</w:t>
+      </w:r>
+      <w:r>
+        <w:t xml:space="preserve">, 2022, pp. 12888–12900.</w:t>
+      </w:r>
+    </w:p>
+    <w:p>
+      <w:pPr>
+        <w:spacing w:after="140" w:line="276"/>
+        <w:jc w:val="both"/>
+      </w:pPr>
+      <w:r>
+        <w:t xml:space="preserve">[8] W. Kim, B. Son, and I. Kim, "ViLT: Vision-and-language transformer without convolution or region supervision," in </w:t>
+      </w:r>
+      <w:r>
+        <w:rPr>
+          <w:i/>
+          <w:iCs/>
+        </w:rPr>
+        <w:t xml:space="preserve">Proc. 38th Int. Conf. Machine Learning (ICML)</w:t>
+      </w:r>
+      <w:r>
+        <w:t xml:space="preserve">, 2021, pp. 5583–5594.</w:t>
+      </w:r>
+    </w:p>
+    <w:p>
+      <w:pPr>
+        <w:spacing w:after="140" w:line="276"/>
+        <w:jc w:val="both"/>
+      </w:pPr>
+      <w:r>
+        <w:t xml:space="preserve">[9] N. Carion </w:t>
+      </w:r>
+      <w:r>
+        <w:rPr>
+          <w:i/>
+          <w:iCs/>
+        </w:rPr>
+        <w:t xml:space="preserve">et al.</w:t>
+      </w:r>
+      <w:r>
+        <w:t xml:space="preserve">, "End-to-end object detection with transformers," in </w:t>
+      </w:r>
+      <w:r>
+        <w:rPr>
+          <w:i/>
+          <w:iCs/>
+        </w:rPr>
+        <w:t xml:space="preserve">Proc. European Conf. Computer Vision (ECCV)</w:t>
+      </w:r>
+      <w:r>
+        <w:t xml:space="preserve">, 2020, pp. 213–229.</w:t>
+      </w:r>
+    </w:p>
+    <w:p>
+      <w:pPr>
+        <w:spacing w:after="140" w:line="276"/>
+        <w:jc w:val="both"/>
+      </w:pPr>
+      <w:r>
+        <w:t xml:space="preserve">[10] A. Ratner </w:t>
+      </w:r>
+      <w:r>
+        <w:rPr>
+          <w:i/>
+          <w:iCs/>
+        </w:rPr>
+        <w:t xml:space="preserve">et al.</w:t>
+      </w:r>
+      <w:r>
+        <w:t xml:space="preserve">, "Snorkel: Rapid training data creation with weak supervision," </w:t>
+      </w:r>
+      <w:r>
+        <w:rPr>
+          <w:i/>
+          <w:iCs/>
+        </w:rPr>
+        <w:t xml:space="preserve">Proc. VLDB Endowment</w:t>
+      </w:r>
+      <w:r>
+        <w:t xml:space="preserve">, vol. 11, no. 3, pp. 269–282, 2017.</w:t>
+      </w:r>
+    </w:p>
+    <w:p>
+      <w:pPr>
+        <w:spacing w:after="140" w:line="276"/>
+        <w:jc w:val="both"/>
+      </w:pPr>
+      <w:r>
+        <w:t xml:space="preserve">[11] R. Artstein and M. Poesio, "Inter-coder agreement for computational linguistics," </w:t>
+      </w:r>
+      <w:r>
+        <w:rPr>
+          <w:i/>
+          <w:iCs/>
+        </w:rPr>
+        <w:t xml:space="preserve">Computational Linguistics</w:t>
+      </w:r>
+      <w:r>
+        <w:t xml:space="preserve">, vol. 34, no. 4, pp. 555–596, 2008.</w:t>
+      </w:r>
+    </w:p>
+    <w:p>
+      <w:pPr>
+        <w:spacing w:after="140" w:line="276"/>
+        <w:jc w:val="both"/>
+      </w:pPr>
+      <w:r>
+        <w:t xml:space="preserve">[12] Qwen Team, "Qwen3-VL technical report," arXiv:2511.21631, 2025.</w:t>
+      </w:r>
+    </w:p>
+    <w:p>
+      <w:pPr>
+        <w:spacing w:after="140" w:line="276"/>
+        <w:jc w:val="both"/>
+      </w:pPr>
+      <w:r>
+        <w:t xml:space="preserve">[13] J. Zhu </w:t>
+      </w:r>
+      <w:r>
+        <w:rPr>
+          <w:i/>
+          <w:iCs/>
+        </w:rPr>
+        <w:t xml:space="preserve">et al.</w:t>
+      </w:r>
+      <w:r>
+        <w:t xml:space="preserve">, "InternVL3: Exploring advanced training and test-time recipes for open-source multimodal models," arXiv:2504.10479, 2025.</w:t>
+      </w:r>
+    </w:p>
+    <w:p>
+      <w:pPr>
+        <w:spacing w:after="140" w:line="276"/>
+        <w:jc w:val="both"/>
+      </w:pPr>
+      <w:r>
+        <w:t xml:space="preserve">[14] A. Rohrbach </w:t>
+      </w:r>
+      <w:r>
+        <w:rPr>
+          <w:i/>
+          <w:iCs/>
+        </w:rPr>
+        <w:t xml:space="preserve">et al.</w:t>
+      </w:r>
+      <w:r>
+        <w:t xml:space="preserve">, "Object hallucination in image captioning," in </w:t>
+      </w:r>
+      <w:r>
+        <w:rPr>
+          <w:i/>
+          <w:iCs/>
+        </w:rPr>
+        <w:t xml:space="preserve">Proc. Conf. Empirical Methods in Natural Language Processing (EMNLP)</w:t>
+      </w:r>
+      <w:r>
+        <w:t xml:space="preserve">, 2018, pp. 4035–4045.</w:t>
+      </w:r>
+    </w:p>
+    <w:p>
+      <w:pPr>
+        <w:spacing w:after="140" w:line="276"/>
+        <w:jc w:val="both"/>
+      </w:pPr>
+      <w:r>
+        <w:t xml:space="preserve">[15] B. Castellano, "PySceneDetect: Video scene cut detection and analysis tool," 2014–2025. [Online]. Available: https://www.scenedetect.com</w:t>
+      </w:r>
+    </w:p>
+    <w:p>
+      <w:pPr>
+        <w:spacing w:after="140" w:line="276"/>
+        <w:jc w:val="both"/>
+      </w:pPr>
+      <w:r>
+        <w:t xml:space="preserve">[16] C.-Y. Lin, "ROUGE: A package for automatic evaluation of summaries," in </w:t>
+      </w:r>
+      <w:r>
+        <w:rPr>
+          <w:i/>
+          <w:iCs/>
+        </w:rPr>
+        <w:t xml:space="preserve">Text Summarization Branches Out</w:t>
+      </w:r>
+      <w:r>
+        <w:t xml:space="preserve">, ACL Workshop, 2004, pp. 74–81.</w:t>
+      </w:r>
+    </w:p>
+    <w:p>
+      <w:pPr>
+        <w:spacing w:after="140" w:line="276"/>
+        <w:jc w:val="both"/>
+      </w:pPr>
+      <w:r>
+        <w:t xml:space="preserve">[17] R. Smith, "An overview of the Tesseract OCR engine," in </w:t>
+      </w:r>
+      <w:r>
+        <w:rPr>
+          <w:i/>
+          <w:iCs/>
+        </w:rPr>
+        <w:t xml:space="preserve">Proc. 9th Int. Conf. Document Analysis and Recognition (ICDAR)</w:t>
+      </w:r>
+      <w:r>
+        <w:t xml:space="preserve">, 2007, pp. 629–633.</w:t>
+      </w:r>
+    </w:p>
+    <w:p>
+      <w:pPr>
+        <w:spacing w:after="140" w:line="276"/>
+        <w:jc w:val="both"/>
+      </w:pPr>
+      <w:r>
+        <w:t xml:space="preserve">[18] N. Reimers and I. Gurevych, "Sentence-BERT: Sentence embeddings using Siamese BERT-networks," in </w:t>
+      </w:r>
+      <w:r>
+        <w:rPr>
+          <w:i/>
+          <w:iCs/>
+        </w:rPr>
+        <w:t xml:space="preserve">Proc. EMNLP-IJCNLP</w:t>
+      </w:r>
+      <w:r>
+        <w:t xml:space="preserve">, 2019, pp. 3982–3992.</w:t>
+      </w:r>
+    </w:p>
+    <w:p>
+      <w:pPr>
+        <w:spacing w:after="140" w:line="276"/>
+        <w:jc w:val="both"/>
+      </w:pPr>
+      <w:r>
+        <w:t xml:space="preserve">[19] R. Campos </w:t>
+      </w:r>
+      <w:r>
+        <w:rPr>
+          <w:i/>
+          <w:iCs/>
+        </w:rPr>
+        <w:t xml:space="preserve">et al.</w:t>
+      </w:r>
+      <w:r>
+        <w:t xml:space="preserve">, "YAKE! Keyword extraction from single documents using multiple local features," </w:t>
+      </w:r>
+      <w:r>
+        <w:rPr>
+          <w:i/>
+          <w:iCs/>
+        </w:rPr>
+        <w:t xml:space="preserve">Information Sciences</w:t>
+      </w:r>
+      <w:r>
+        <w:t xml:space="preserve">, vol. 509, pp. 257–289, 2020.</w:t>
+      </w:r>
+    </w:p>
+    <w:p>
+      <w:pPr>
+        <w:spacing w:after="140" w:line="276"/>
+        <w:jc w:val="both"/>
+      </w:pPr>
+      <w:r>
+        <w:t xml:space="preserve">[20] M. Grootendorst, "KeyBERT: Minimal keyword extraction with BERT," 2020. [Online]. Available: https://github.com/MaartenGr/KeyBERT</w:t>
+      </w:r>
+    </w:p>
+    <w:p>
+      <w:pPr>
+        <w:spacing w:after="140" w:line="276"/>
+        <w:jc w:val="both"/>
+      </w:pPr>
+      <w:r>
+        <w:t xml:space="preserve">[21] R. B. Yousuf, S. Xu, M. Sharma, A. Neeser, C. Latimer, and N. Ramakrishnan, "Utilizing metadata for better retrieval-augmented generation," arXiv:2601.11863, 2026.</w:t>
+      </w:r>
+    </w:p>
+    <w:p>
+      <w:pPr>
+        <w:spacing w:after="140" w:line="276"/>
+        <w:jc w:val="both"/>
+      </w:pPr>
+      <w:r>
+        <w:t xml:space="preserve">[22] R. Liu, H. Tang, H. Liu, Y. Ge, Y. Shan, C. Li, and J. Yang, "PPLLaVA: Varied video sequence understanding with prompt guidance," arXiv:2411.02327, 2024.</w:t>
+      </w:r>
+    </w:p>
+    <w:p>
+      <w:pPr>
+        <w:spacing w:after="140" w:line="276"/>
+        <w:jc w:val="both"/>
+      </w:pPr>
+      <w:r>
+        <w:t xml:space="preserve">[23] Hugging Face, "Image-text-to-text," Transformers documentation, 2026. [Online]. Available: https://huggingface.co/docs/transformers/tasks/image_text_to_text</w:t>
+      </w:r>
+    </w:p>
+    <w:p>
+      <w:pPr>
+        <w:spacing w:after="140" w:line="276"/>
+        <w:jc w:val="both"/>
+      </w:pPr>
+      <w:r>
+        <w:t xml:space="preserve">[24] Hugging Face, "Video-text-to-text," Transformers documentation, 2026. [Online]. Available: https://huggingface.co/docs/transformers/tasks/video_text_to_text</w:t>
       </w:r>
     </w:p>
     <w:sectPr>

</xml_diff>